<commit_message>
build(dist): rebuild all docx artifacts from current manuscript sources
Thesis files (dist/luan_an/): 7 files rebuilt — includes §7.4 P6 entry,
P8 UTF-8 fix, timeline update (34fd730) + §4.5.4 P7 methodology (d328661)

CTU chapters (dist/luan_an_ctu/): 5 files rebuilt — reflects all thesis
chapter updates from prior and current sessions

English manuscripts (dist/manuscripts/en/): P3–P8 all rebuilt:
- P3: 250-word abstract (151a44b) + Haans 4-condition (5f8ac68)
- P4: AI voice, author block, R1 sensitivity, conceptual model updates
- P5: Haans 4-condition + APA7 ref (4ad334f)
- P6: k=238/K=288 corrections (a95ed29)
- P7: TP formula fix + Haans 4-condition + ref (5ba7445, 4ad334f)
- P8: DOI addition (ff28030) — new entry in dist/

https://claude.ai/code/session_01GMFmEtt6FYiJ4MKzBNCLqb
</commit_message>
<xml_diff>
--- a/dist/luan_an/00_optimal_plan_vi.docx
+++ b/dist/luan_an/00_optimal_plan_vi.docx
@@ -419,7 +419,7 @@
         <w:t xml:space="preserve"> </w:t>
       </w:r>
       <w:r>
-        <w:t xml:space="preserve">(cập nhật 1982–2026, mục tiêu ~172 effect sizes) với</w:t>
+        <w:t xml:space="preserve">(cập nhật 1982–2026, pool K=288 / k=238 baseline, mục tiêu k≥250 sau formal search) với</w:t>
       </w:r>
       <w:r>
         <w:t xml:space="preserve"> </w:t>
@@ -435,7 +435,7 @@
         <w:t xml:space="preserve"> </w:t>
       </w:r>
       <w:r>
-        <w:t xml:space="preserve">sử dụng dữ liệu vi mô của các nền kinh tế châu Á (101.185 doanh nghiệp · 108 cặp quốc gia × năm · giai đoạn 2009–2025) từ World Bank Enterprise Surveys, kế thừa và mở rộng từ pool 17 nước châu Á mới nổi đã được tác giả công bố trước đó (Đỗ &amp; Phan, 2026 — VEFR). Pool đầy đủ bao gồm 41 nền kinh tế châu Á trong phạm vi đề tài chính thức, cộng với 6 nước Pacific SIDS được xử lý như boundary case adjacent. Thiết kế nghiên cứu mixed synthesis-empirical này hiếm gặp trong literature IB về châu Á và cho phép đối thoại đồng thời giữa bằng chứng tổng hợp ở cấp literature và bằng chứng thực nghiệm trực tiếp ở cấp doanh nghiệp (Borenstein et al., 2009; Hunter &amp; Schmidt, 2004).</w:t>
+        <w:t xml:space="preserve">sử dụng dữ liệu vi mô của các nền kinh tế châu Á (101.185 doanh nghiệp · 108 cặp quốc gia × năm · giai đoạn 2009–2025) từ World Bank Enterprise Surveys, kế thừa và mở rộng từ pool 17 nước châu Á mới nổi đã được tác giả công bố trước đó (Đỗ &amp; Phan, 2026 — VEFR). Pool đầy đủ bao gồm 47–49 nền kinh tế châu Á và Thái Bình Dương (bao gồm 6–8 nền kinh tế Pacific SIDS) trong phạm vi đề tài chính thức. Thiết kế nghiên cứu mixed synthesis-empirical này hiếm gặp trong literature IB về châu Á và cho phép đối thoại đồng thời giữa bằng chứng tổng hợp ở cấp literature và bằng chứng thực nghiệm trực tiếp ở cấp doanh nghiệp (Borenstein et al., 2009; Hunter &amp; Schmidt, 2004).</w:t>
       </w:r>
     </w:p>
     <w:bookmarkEnd w:id="23"/>
@@ -892,10 +892,10 @@
           <w:bCs/>
           <w:b/>
         </w:rPr>
-        <w:t xml:space="preserve">Phạm vi không gian (chính)</w:t>
-      </w:r>
-      <w:r>
-        <w:t xml:space="preserve">: 41 nền kinh tế châu Á có dữ liệu WBES, tổ chức theo 5 sub-regime ICRV (Advanced innovation-driven, Advanced resource-driven, Upper-middle, Emerging, Frontier).</w:t>
+        <w:t xml:space="preserve">Phạm vi không gian</w:t>
+      </w:r>
+      <w:r>
+        <w:t xml:space="preserve">: 47–49 nền kinh tế châu Á và Thái Bình Dương có dữ liệu WBES, tổ chức theo</w:t>
       </w:r>
       <w:r>
         <w:t xml:space="preserve"> </w:t>
@@ -905,10 +905,13 @@
           <w:bCs/>
           <w:b/>
         </w:rPr>
-        <w:t xml:space="preserve">Phạm vi mở rộng (boundary case)</w:t>
-      </w:r>
-      <w:r>
-        <w:t xml:space="preserve">: 6 nước Pacific SIDS được phân tích như adjacent để kiểm định forced internationalization penalty (Đỗ &amp; Phan, 2026 — P8 manuscript). Nhật Bản hiện chưa có dữ liệu thực nghiệm phù hợp nên không thuộc empirical scope.</w:t>
+        <w:t xml:space="preserve">6 sub-regime ICRV</w:t>
+      </w:r>
+      <w:r>
+        <w:t xml:space="preserve"> </w:t>
+      </w:r>
+      <w:r>
+        <w:t xml:space="preserve">(I: Advanced innovation-driven, II: Advanced resource-driven, III: Upper-middle, IV: Emerging, V: Frontier, VI: Pacific SIDS). P8 mở rộng thêm bằng phân tích chuyên sâu các nền kinh tế Nhóm VI (SIDS) để kiểm định forced internationalization penalty (Đỗ &amp; Phan, 2026). Nhật Bản hiện chưa có dữ liệu WBES phù hợp nên không thuộc empirical scope.</w:t>
       </w:r>
     </w:p>
     <w:p>
@@ -1102,19 +1105,19 @@
               <w:jc w:val="left"/>
             </w:pPr>
             <w:r>
-              <w:t xml:space="preserve">P3 Singapore</w:t>
-            </w:r>
-          </w:p>
-        </w:tc>
-        <w:tc>
-          <w:tcPr/>
-          <w:p>
-            <w:pPr>
-              <w:pStyle w:val="Compact"/>
-              <w:jc w:val="left"/>
-            </w:pPr>
-            <w:r>
-              <w:t xml:space="preserve">Bằng chứng country-level ASEAN benchmark với TCI + DAI (Ch.4.2)</w:t>
+              <w:t xml:space="preserve">P3 Vietnam</w:t>
+            </w:r>
+          </w:p>
+        </w:tc>
+        <w:tc>
+          <w:tcPr/>
+          <w:p>
+            <w:pPr>
+              <w:pStyle w:val="Compact"/>
+              <w:jc w:val="left"/>
+            </w:pPr>
+            <w:r>
+              <w:t xml:space="preserve">Bằng chứng country-level transitional economy với TCI + DAI — JABS under review (Ch.4.2)</w:t>
             </w:r>
           </w:p>
         </w:tc>
@@ -1140,19 +1143,19 @@
               <w:jc w:val="left"/>
             </w:pPr>
             <w:r>
-              <w:t xml:space="preserve">P4 Vietnam</w:t>
-            </w:r>
-          </w:p>
-        </w:tc>
-        <w:tc>
-          <w:tcPr/>
-          <w:p>
-            <w:pPr>
-              <w:pStyle w:val="Compact"/>
-              <w:jc w:val="left"/>
-            </w:pPr>
-            <w:r>
-              <w:t xml:space="preserve">Bằng chứng country-level transitional economy với TCI + DAI (Ch.4.2)</w:t>
+              <w:t xml:space="preserve">P4 Singapore</w:t>
+            </w:r>
+          </w:p>
+        </w:tc>
+        <w:tc>
+          <w:tcPr/>
+          <w:p>
+            <w:pPr>
+              <w:pStyle w:val="Compact"/>
+              <w:jc w:val="left"/>
+            </w:pPr>
+            <w:r>
+              <w:t xml:space="preserve">Bằng chứng country-level ASEAN benchmark với TCI + DAI — MIR under review (Ch.4.2)</w:t>
             </w:r>
           </w:p>
         </w:tc>
@@ -1190,7 +1193,7 @@
               <w:jc w:val="left"/>
             </w:pPr>
             <w:r>
-              <w:t xml:space="preserve">Bằng chứng temporal heterogeneity (Ch.4.5)</w:t>
+              <w:t xml:space="preserve">Bằng chứng temporal heterogeneity (Ch.4.5) — IJOEM under review</w:t>
             </w:r>
           </w:p>
         </w:tc>
@@ -1240,7 +1243,7 @@
               <w:jc w:val="left"/>
             </w:pPr>
             <w:r>
-              <w:t xml:space="preserve">Sẽ viết tiếp</w:t>
+              <w:t xml:space="preserve">Bản thảo đã viết (IBR under review)</w:t>
             </w:r>
           </w:p>
         </w:tc>
@@ -1278,7 +1281,7 @@
               <w:jc w:val="left"/>
             </w:pPr>
             <w:r>
-              <w:t xml:space="preserve">Sẽ viết tiếp</w:t>
+              <w:t xml:space="preserve">Bản thảo đã viết (JIBS under revision)</w:t>
             </w:r>
           </w:p>
         </w:tc>
@@ -1316,7 +1319,7 @@
               <w:jc w:val="left"/>
             </w:pPr>
             <w:r>
-              <w:t xml:space="preserve">Bản thảo REVISED v2</w:t>
+              <w:t xml:space="preserve">Bản thảo đã viết (World Development under revision)</w:t>
             </w:r>
           </w:p>
         </w:tc>

</xml_diff>